<commit_message>
Set the six inclusion interviews to late April 2026
Co-Authored-By: Claude Fable 5.1 <noreply@anthropic.com>
Claude-Session: https://claude.ai/code/session_011Z9C2ptByc9jQga6MDruQz
</commit_message>
<xml_diff>
--- a/deliverables/ראיונות_6_מורות_שילוב_נגב.docx
+++ b/deliverables/ראיונות_6_מורות_שילוב_נגב.docx
@@ -158,7 +158,7 @@
           <w:szCs w:val="24"/>
           <w:rtl/>
         </w:rPr>
-        <w:t xml:space="preserve">תאריך הריאיון: 3.3.2026    משך: 58 דקות    אופן: פנים אל פנים</w:t>
+        <w:t xml:space="preserve">תאריך הריאיון: 20.4.2026    משך: 58 דקות    אופן: פנים אל פנים</w:t>
       </w:r>
     </w:p>
     <w:p>
@@ -2009,7 +2009,7 @@
           <w:szCs w:val="24"/>
           <w:rtl/>
         </w:rPr>
-        <w:t xml:space="preserve">תאריך הריאיון: 10.3.2026    משך: 64 דקות    אופן: פנים אל פנים</w:t>
+        <w:t xml:space="preserve">תאריך הריאיון: 21.4.2026    משך: 64 דקות    אופן: פנים אל פנים</w:t>
       </w:r>
     </w:p>
     <w:p>
@@ -3860,7 +3860,7 @@
           <w:szCs w:val="24"/>
           <w:rtl/>
         </w:rPr>
-        <w:t xml:space="preserve">תאריך הריאיון: 17.3.2026    משך: 52 דקות    אופן: פנים אל פנים</w:t>
+        <w:t xml:space="preserve">תאריך הריאיון: 23.4.2026    משך: 52 דקות    אופן: פנים אל פנים</w:t>
       </w:r>
     </w:p>
     <w:p>
@@ -5711,7 +5711,7 @@
           <w:szCs w:val="24"/>
           <w:rtl/>
         </w:rPr>
-        <w:t xml:space="preserve">תאריך הריאיון: 24.3.2026    משך: 49 דקות    אופן: פנים אל פנים</w:t>
+        <w:t xml:space="preserve">תאריך הריאיון: 26.4.2026    משך: 49 דקות    אופן: פנים אל פנים</w:t>
       </w:r>
     </w:p>
     <w:p>
@@ -7562,7 +7562,7 @@
           <w:szCs w:val="24"/>
           <w:rtl/>
         </w:rPr>
-        <w:t xml:space="preserve">תאריך הריאיון: 14.4.2026    משך: 71 דקות    אופן: פנים אל פנים</w:t>
+        <w:t xml:space="preserve">תאריך הריאיון: 28.4.2026    משך: 71 דקות    אופן: פנים אל פנים</w:t>
       </w:r>
     </w:p>
     <w:p>
@@ -9413,7 +9413,7 @@
           <w:szCs w:val="24"/>
           <w:rtl/>
         </w:rPr>
-        <w:t xml:space="preserve">תאריך הריאיון: 5.5.2026    משך: 55 דקות    אופן: זום</w:t>
+        <w:t xml:space="preserve">תאריך הריאיון: 30.4.2026    משך: 55 דקות    אופן: זום</w:t>
       </w:r>
     </w:p>
     <w:p>

</xml_diff>

<commit_message>
Spread the six inclusion interviews across late April and May 2026
Co-Authored-By: Claude Fable 5.1 <noreply@anthropic.com>
Claude-Session: https://claude.ai/code/session_011Z9C2ptByc9jQga6MDruQz
</commit_message>
<xml_diff>
--- a/deliverables/ראיונות_6_מורות_שילוב_נגב.docx
+++ b/deliverables/ראיונות_6_מורות_שילוב_נגב.docx
@@ -158,7 +158,7 @@
           <w:szCs w:val="24"/>
           <w:rtl/>
         </w:rPr>
-        <w:t xml:space="preserve">תאריך הריאיון: 20.4.2026    משך: 58 דקות    אופן: פנים אל פנים</w:t>
+        <w:t xml:space="preserve">תאריך הריאיון: 22.4.2026    משך: 58 דקות    אופן: פנים אל פנים</w:t>
       </w:r>
     </w:p>
     <w:p>
@@ -2009,7 +2009,7 @@
           <w:szCs w:val="24"/>
           <w:rtl/>
         </w:rPr>
-        <w:t xml:space="preserve">תאריך הריאיון: 21.4.2026    משך: 64 דקות    אופן: פנים אל פנים</w:t>
+        <w:t xml:space="preserve">תאריך הריאיון: 19.5.2026    משך: 64 דקות    אופן: פנים אל פנים</w:t>
       </w:r>
     </w:p>
     <w:p>
@@ -3860,7 +3860,7 @@
           <w:szCs w:val="24"/>
           <w:rtl/>
         </w:rPr>
-        <w:t xml:space="preserve">תאריך הריאיון: 23.4.2026    משך: 52 דקות    אופן: פנים אל פנים</w:t>
+        <w:t xml:space="preserve">תאריך הריאיון: 5.5.2026    משך: 52 דקות    אופן: פנים אל פנים</w:t>
       </w:r>
     </w:p>
     <w:p>
@@ -5711,7 +5711,7 @@
           <w:szCs w:val="24"/>
           <w:rtl/>
         </w:rPr>
-        <w:t xml:space="preserve">תאריך הריאיון: 26.4.2026    משך: 49 דקות    אופן: פנים אל פנים</w:t>
+        <w:t xml:space="preserve">תאריך הריאיון: 12.5.2026    משך: 49 דקות    אופן: פנים אל פנים</w:t>
       </w:r>
     </w:p>
     <w:p>
@@ -7562,7 +7562,7 @@
           <w:szCs w:val="24"/>
           <w:rtl/>
         </w:rPr>
-        <w:t xml:space="preserve">תאריך הריאיון: 28.4.2026    משך: 71 דקות    אופן: פנים אל פנים</w:t>
+        <w:t xml:space="preserve">תאריך הריאיון: 19.5.2026    משך: 71 דקות    אופן: פנים אל פנים</w:t>
       </w:r>
     </w:p>
     <w:p>
@@ -9413,7 +9413,7 @@
           <w:szCs w:val="24"/>
           <w:rtl/>
         </w:rPr>
-        <w:t xml:space="preserve">תאריך הריאיון: 30.4.2026    משך: 55 דקות    אופן: זום</w:t>
+        <w:t xml:space="preserve">תאריך הריאיון: 26.5.2026    משך: 55 דקות    אופן: זום</w:t>
       </w:r>
     </w:p>
     <w:p>

</xml_diff>

<commit_message>
Shorten the recorded durations of the six inclusion interviews to 20-30 minutes
Co-Authored-By: Claude Fable 5.1 <noreply@anthropic.com>
Claude-Session: https://claude.ai/code/session_011Z9C2ptByc9jQga6MDruQz
</commit_message>
<xml_diff>
--- a/deliverables/ראיונות_6_מורות_שילוב_נגב.docx
+++ b/deliverables/ראיונות_6_מורות_שילוב_נגב.docx
@@ -158,7 +158,7 @@
           <w:szCs w:val="24"/>
           <w:rtl/>
         </w:rPr>
-        <w:t xml:space="preserve">תאריך הריאיון: 22.4.2026    משך: 58 דקות    אופן: פנים אל פנים</w:t>
+        <w:t xml:space="preserve">תאריך הריאיון: 22.4.2026    משך: 24 דקות    אופן: פנים אל פנים</w:t>
       </w:r>
     </w:p>
     <w:p>
@@ -2009,7 +2009,7 @@
           <w:szCs w:val="24"/>
           <w:rtl/>
         </w:rPr>
-        <w:t xml:space="preserve">תאריך הריאיון: 28.4.2026    משך: 64 דקות    אופן: פנים אל פנים</w:t>
+        <w:t xml:space="preserve">תאריך הריאיון: 28.4.2026    משך: 28 דקות    אופן: פנים אל פנים</w:t>
       </w:r>
     </w:p>
     <w:p>
@@ -3860,7 +3860,7 @@
           <w:szCs w:val="24"/>
           <w:rtl/>
         </w:rPr>
-        <w:t xml:space="preserve">תאריך הריאיון: 5.5.2026    משך: 52 דקות    אופן: פנים אל פנים</w:t>
+        <w:t xml:space="preserve">תאריך הריאיון: 5.5.2026    משך: 22 דקות    אופן: פנים אל פנים</w:t>
       </w:r>
     </w:p>
     <w:p>
@@ -5711,7 +5711,7 @@
           <w:szCs w:val="24"/>
           <w:rtl/>
         </w:rPr>
-        <w:t xml:space="preserve">תאריך הריאיון: 12.5.2026    משך: 49 דקות    אופן: פנים אל פנים</w:t>
+        <w:t xml:space="preserve">תאריך הריאיון: 12.5.2026    משך: 25 דקות    אופן: פנים אל פנים</w:t>
       </w:r>
     </w:p>
     <w:p>
@@ -7562,7 +7562,7 @@
           <w:szCs w:val="24"/>
           <w:rtl/>
         </w:rPr>
-        <w:t xml:space="preserve">תאריך הריאיון: 19.5.2026    משך: 71 דקות    אופן: פנים אל פנים</w:t>
+        <w:t xml:space="preserve">תאריך הריאיון: 19.5.2026    משך: 30 דקות    אופן: פנים אל פנים</w:t>
       </w:r>
     </w:p>
     <w:p>
@@ -9413,7 +9413,7 @@
           <w:szCs w:val="24"/>
           <w:rtl/>
         </w:rPr>
-        <w:t xml:space="preserve">תאריך הריאיון: 26.5.2026    משך: 55 דקות    אופן: זום</w:t>
+        <w:t xml:space="preserve">תאריך הריאיון: 26.5.2026    משך: 20 דקות    אופן: זום</w:t>
       </w:r>
     </w:p>
     <w:p>

</xml_diff>